<commit_message>
Upload “src/content/bios/Van Heuven Goedhart-GJ 2012.docx”
</commit_message>
<xml_diff>
--- a/src/content/bios/Van Heuven Goedhart-GJ 2012.docx
+++ b/src/content/bios/Van Heuven Goedhart-GJ 2012.docx
@@ -13,7 +13,19 @@
         <w:rPr>
           <w:b/>
         </w:rPr>
-        <w:t xml:space="preserve">[VAN HEUVEN] GOEDHART, Gerrit Jan, first United Nations High Commissioner for Refugees (UNHCR) 1951-1956, was born 19 March 1901 in </w:t>
+        <w:t xml:space="preserve">[VAN HEUVEN] GOEDHART, Gerrit Jan, </w:t>
+      </w:r>
+      <w:r>
+        <w:rPr>
+          <w:b/>
+        </w:rPr>
+        <w:t xml:space="preserve">Dutch journalist and </w:t>
+      </w:r>
+      <w:r>
+        <w:rPr>
+          <w:b/>
+        </w:rPr>
+        <w:t xml:space="preserve">first United Nations High Commissioner for Refugees (UNHCR) 1951-1956, was born 19 March 1901 in </w:t>
       </w:r>
       <w:proofErr w:type="spellStart"/>
       <w:r>
@@ -83,7 +95,7 @@
                     </pic:cNvPicPr>
                   </pic:nvPicPr>
                   <pic:blipFill>
-                    <a:blip r:embed="rId4">
+                    <a:blip r:embed="rId6">
                       <a:extLst>
                         <a:ext uri="{28A0092B-C50C-407E-A947-70E740481C1C}">
                           <a14:useLocalDpi xmlns:a14="http://schemas.microsoft.com/office/drawing/2010/main" val="0"/>
@@ -332,7 +344,7 @@
           <w:sz w:val="24"/>
           <w:szCs w:val="24"/>
         </w:rPr>
-        <w:t xml:space="preserve"> he managed to increase its circulation and prestige, all the while solidifying it as one of the most anti-Nazi newspapers </w:t>
+        <w:t xml:space="preserve"> he managed to increase </w:t>
       </w:r>
       <w:r>
         <w:rPr>
@@ -342,7 +354,7 @@
           <w:szCs w:val="24"/>
         </w:rPr>
         <w:lastRenderedPageBreak/>
-        <w:t xml:space="preserve">in the country. Besides his work as editor-in-chief, he played a role in two associations that opposed Nazism and anti-Semitism and defended democracy. </w:t>
+        <w:t xml:space="preserve">its circulation and prestige, all the while solidifying it as one of the most anti-Nazi newspapers in the country. Besides his work as editor-in-chief, he played a role in two associations that opposed Nazism and anti-Semitism and defended democracy. </w:t>
       </w:r>
     </w:p>
     <w:p>
@@ -1908,7 +1920,7 @@
       <w:r>
         <w:t xml:space="preserve">, 8/4, 1956, 447-449’; speeches available at: </w:t>
       </w:r>
-      <w:hyperlink r:id="rId5" w:history="1">
+      <w:hyperlink r:id="rId7" w:history="1">
         <w:r>
           <w:rPr>
             <w:rStyle w:val="Hyperlink"/>
@@ -2140,7 +2152,7 @@
       <w:r>
         <w:t xml:space="preserve">, Amsterdam 2011; </w:t>
       </w:r>
-      <w:hyperlink r:id="rId6" w:history="1">
+      <w:hyperlink r:id="rId8" w:history="1">
         <w:r>
           <w:rPr>
             <w:rStyle w:val="Hyperlink"/>
@@ -2242,7 +2254,7 @@
       <w:r>
         <w:t xml:space="preserve">, Edited by Bob Reinalda, Kent J. Kille and Jaci L. Eisenberg, </w:t>
       </w:r>
-      <w:hyperlink r:id="rId7" w:history="1">
+      <w:hyperlink r:id="rId9" w:history="1">
         <w:r>
           <w:rPr>
             <w:rStyle w:val="Hyperlink"/>
@@ -2265,15 +2277,34 @@
     </w:p>
     <w:p/>
     <w:sectPr>
-      <w:headerReference w:type="even" r:id="rId8"/>
-      <w:headerReference w:type="default" r:id="rId9"/>
-      <w:footerReference w:type="default" r:id="rId10"/>
+      <w:headerReference w:type="even" r:id="rId10"/>
+      <w:headerReference w:type="default" r:id="rId11"/>
+      <w:footerReference w:type="default" r:id="rId12"/>
       <w:pgSz w:w="11900" w:h="16840"/>
       <w:pgMar w:top="1417" w:right="1417" w:bottom="1417" w:left="1417" w:header="720" w:footer="720" w:gutter="0"/>
       <w:cols w:space="720"/>
     </w:sectPr>
   </w:body>
 </w:document>
+</file>
+
+<file path=word/endnotes.xml><?xml version="1.0" encoding="utf-8"?>
+<w:endnotes xmlns:wpc="http://schemas.microsoft.com/office/word/2010/wordprocessingCanvas" xmlns:cx="http://schemas.microsoft.com/office/drawing/2014/chartex" xmlns:cx1="http://schemas.microsoft.com/office/drawing/2015/9/8/chartex" xmlns:cx2="http://schemas.microsoft.com/office/drawing/2015/10/21/chartex" xmlns:cx3="http://schemas.microsoft.com/office/drawing/2016/5/9/chartex" xmlns:cx4="http://schemas.microsoft.com/office/drawing/2016/5/10/chartex" xmlns:cx5="http://schemas.microsoft.com/office/drawing/2016/5/11/chartex" xmlns:cx6="http://schemas.microsoft.com/office/drawing/2016/5/12/chartex" xmlns:cx7="http://schemas.microsoft.com/office/drawing/2016/5/13/chartex" xmlns:cx8="http://schemas.microsoft.com/office/drawing/2016/5/14/chartex" xmlns:mc="http://schemas.openxmlformats.org/markup-compatibility/2006" xmlns:m="http://schemas.openxmlformats.org/officeDocument/2006/math" xmlns:aink="http://schemas.microsoft.com/office/drawing/2016/ink" xmlns:am3d="http://schemas.microsoft.com/office/drawing/2017/model3d" xmlns:oel="http://schemas.microsoft.com/office/2019/extlst" xmlns:r="http://schemas.openxmlformats.org/officeDocument/2006/relationships" xmlns:wp14="http://schemas.microsoft.com/office/word/2010/wordprocessingDrawing" xmlns:wp="http://schemas.openxmlformats.org/drawingml/2006/wordprocessingDrawing" xmlns:wpg="http://schemas.microsoft.com/office/word/2010/wordprocessingGroup" xmlns:wpi="http://schemas.microsoft.com/office/word/2010/wordprocessingInk" xmlns:wps="http://schemas.microsoft.com/office/word/2010/wordprocessingShape" xmlns:o="urn:schemas-microsoft-com:office:office" xmlns:v="urn:schemas-microsoft-com:vml" xmlns:w10="urn:schemas-microsoft-com:office:word" xmlns:w="http://schemas.openxmlformats.org/wordprocessingml/2006/main" xmlns:w14="http://schemas.microsoft.com/office/word/2010/wordml" xmlns:w15="http://schemas.microsoft.com/office/word/2012/wordml" xmlns:w16cei="http://schemas.microsoft.com/office/word/2026/wordml/cei" xmlns:w16cex="http://schemas.microsoft.com/office/word/2018/wordml/cex" xmlns:w16cid="http://schemas.microsoft.com/office/word/2016/wordml/cid" xmlns:w16="http://schemas.microsoft.com/office/word/2018/wordml" xmlns:w16sdtdh="http://schemas.microsoft.com/office/word/2020/wordml/sdtdatahash" xmlns:w16sdtfl="http://schemas.microsoft.com/office/word/2024/wordml/sdtformatlock" xmlns:w16se="http://schemas.microsoft.com/office/word/2015/wordml/symex" xmlns:w16du="http://schemas.microsoft.com/office/word/2023/wordml/word16du" xmlns:wne="http://schemas.microsoft.com/office/word/2006/wordml" mc:Ignorable="w14 w15 w16se w16cid w16 w16cex w16sdtdh w16sdtfl w16du wp14">
+  <w:endnote w:type="separator" w:id="-1">
+    <w:p>
+      <w:r>
+        <w:separator/>
+      </w:r>
+    </w:p>
+  </w:endnote>
+  <w:endnote w:type="continuationSeparator" w:id="0">
+    <w:p>
+      <w:r>
+        <w:continuationSeparator/>
+      </w:r>
+    </w:p>
+  </w:endnote>
+</w:endnotes>
 </file>
 
 <file path=word/footer1.xml><?xml version="1.0" encoding="utf-8"?>
@@ -2324,6 +2355,25 @@
     </w:r>
   </w:p>
 </w:ftr>
+</file>
+
+<file path=word/footnotes.xml><?xml version="1.0" encoding="utf-8"?>
+<w:footnotes xmlns:wpc="http://schemas.microsoft.com/office/word/2010/wordprocessingCanvas" xmlns:cx="http://schemas.microsoft.com/office/drawing/2014/chartex" xmlns:cx1="http://schemas.microsoft.com/office/drawing/2015/9/8/chartex" xmlns:cx2="http://schemas.microsoft.com/office/drawing/2015/10/21/chartex" xmlns:cx3="http://schemas.microsoft.com/office/drawing/2016/5/9/chartex" xmlns:cx4="http://schemas.microsoft.com/office/drawing/2016/5/10/chartex" xmlns:cx5="http://schemas.microsoft.com/office/drawing/2016/5/11/chartex" xmlns:cx6="http://schemas.microsoft.com/office/drawing/2016/5/12/chartex" xmlns:cx7="http://schemas.microsoft.com/office/drawing/2016/5/13/chartex" xmlns:cx8="http://schemas.microsoft.com/office/drawing/2016/5/14/chartex" xmlns:mc="http://schemas.openxmlformats.org/markup-compatibility/2006" xmlns:m="http://schemas.openxmlformats.org/officeDocument/2006/math" xmlns:aink="http://schemas.microsoft.com/office/drawing/2016/ink" xmlns:am3d="http://schemas.microsoft.com/office/drawing/2017/model3d" xmlns:oel="http://schemas.microsoft.com/office/2019/extlst" xmlns:r="http://schemas.openxmlformats.org/officeDocument/2006/relationships" xmlns:wp14="http://schemas.microsoft.com/office/word/2010/wordprocessingDrawing" xmlns:wp="http://schemas.openxmlformats.org/drawingml/2006/wordprocessingDrawing" xmlns:wpg="http://schemas.microsoft.com/office/word/2010/wordprocessingGroup" xmlns:wpi="http://schemas.microsoft.com/office/word/2010/wordprocessingInk" xmlns:wps="http://schemas.microsoft.com/office/word/2010/wordprocessingShape" xmlns:o="urn:schemas-microsoft-com:office:office" xmlns:v="urn:schemas-microsoft-com:vml" xmlns:w10="urn:schemas-microsoft-com:office:word" xmlns:w="http://schemas.openxmlformats.org/wordprocessingml/2006/main" xmlns:w14="http://schemas.microsoft.com/office/word/2010/wordml" xmlns:w15="http://schemas.microsoft.com/office/word/2012/wordml" xmlns:w16cei="http://schemas.microsoft.com/office/word/2026/wordml/cei" xmlns:w16cex="http://schemas.microsoft.com/office/word/2018/wordml/cex" xmlns:w16cid="http://schemas.microsoft.com/office/word/2016/wordml/cid" xmlns:w16="http://schemas.microsoft.com/office/word/2018/wordml" xmlns:w16sdtdh="http://schemas.microsoft.com/office/word/2020/wordml/sdtdatahash" xmlns:w16sdtfl="http://schemas.microsoft.com/office/word/2024/wordml/sdtformatlock" xmlns:w16se="http://schemas.microsoft.com/office/word/2015/wordml/symex" xmlns:w16du="http://schemas.microsoft.com/office/word/2023/wordml/word16du" xmlns:wne="http://schemas.microsoft.com/office/word/2006/wordml" mc:Ignorable="w14 w15 w16se w16cid w16 w16cex w16sdtdh w16sdtfl w16du wp14">
+  <w:footnote w:type="separator" w:id="-1">
+    <w:p>
+      <w:r>
+        <w:separator/>
+      </w:r>
+    </w:p>
+  </w:footnote>
+  <w:footnote w:type="continuationSeparator" w:id="0">
+    <w:p>
+      <w:r>
+        <w:continuationSeparator/>
+      </w:r>
+    </w:p>
+  </w:footnote>
+</w:footnotes>
 </file>
 
 <file path=word/header1.xml><?xml version="1.0" encoding="utf-8"?>

</xml_diff>